<commit_message>
chore: auto-rebuild from Google Docs
</commit_message>
<xml_diff>
--- a/source/Chapter1.docx
+++ b/source/Chapter1.docx
@@ -1691,7 +1691,15 @@
           <w:u w:val="none"/>
           <w:rtl w:val="0"/>
         </w:rPr>
-        <w:t xml:space="preserve">TL;DR: do Clock Tower, Monk’s Friend, Hazeel Cult and get level 35 woodcutting, burning the logs and swapping to oaks at 15. Eat your food if you take damage.</w:t>
+        <w:t xml:space="preserve">TL;DR: do Clock Tower, Monk’s Friend, Hazeel Cult and get level 35 woodcutting, burning the logs and swapping to oaks at 15. Eat your food if you take damage. </w:t>
+      </w:r>
+      <w:r>
+        <w:rPr>
+          <w:i w:val="1"/>
+          <w:iCs w:val="1"/>
+          <w:rtl w:val="0"/>
+        </w:rPr>
+        <w:t xml:space="preserve">You can optimise this even further by cutting oak logs while you have run energy, and burning them when out of run energy.</w:t>
       </w:r>
       <w:r>
         <w:rPr>
@@ -2035,65 +2043,33 @@
           <w:u w:val="none"/>
           <w:rtl w:val="0"/>
         </w:rPr>
-        <w:t xml:space="preserve">Head to Ardougne general store (Aemad’s Adventuring Supplies), buy 3 ropes, 1 water-filled vial pack, 30 balls of wool, 7 papyrus. Restore your prayer at the East Ardougne church, check your insured pets at Probita, buy two silver bars from the Silver Merchant (hop worlds once). Steal cakes until you have at least 98 cakes and 14 bread </w:t>
-      </w:r>
-      <w:r>
-        <w:rPr>
-          <w:b w:val="0"/>
-          <w:bCs w:val="0"/>
-          <w:i w:val="1"/>
-          <w:iCs w:val="1"/>
-          <w:strike w:val="0"/>
-          <w:sz w:val="24"/>
-          <w:szCs w:val="24"/>
-          <w:u w:val="none"/>
-          <w:rtl w:val="0"/>
-        </w:rPr>
-        <w:t xml:space="preserve">(more cakes optional - this will get you to </w:t>
-      </w:r>
-      <w:r>
-        <w:rPr>
-          <w:i w:val="1"/>
-          <w:iCs w:val="1"/>
-          <w:rtl w:val="0"/>
-        </w:rPr>
-        <w:t xml:space="preserve">thieving thresholds and 90+</w:t>
-      </w:r>
-      <w:r>
-        <w:rPr>
-          <w:b w:val="0"/>
-          <w:bCs w:val="0"/>
-          <w:i w:val="1"/>
-          <w:iCs w:val="1"/>
-          <w:strike w:val="0"/>
-          <w:sz w:val="24"/>
-          <w:szCs w:val="24"/>
-          <w:u w:val="none"/>
-          <w:rtl w:val="0"/>
-        </w:rPr>
-        <w:t xml:space="preserve"> firemaking at wintertodt. If you want to go to level 99 collect </w:t>
-      </w:r>
-      <w:r>
-        <w:rPr>
-          <w:i w:val="1"/>
-          <w:iCs w:val="1"/>
-          <w:rtl w:val="0"/>
-        </w:rPr>
-        <w:t xml:space="preserve">1</w:t>
-      </w:r>
-      <w:r>
-        <w:rPr>
-          <w:b w:val="0"/>
-          <w:bCs w:val="0"/>
-          <w:i w:val="1"/>
-          <w:iCs w:val="1"/>
-          <w:strike w:val="0"/>
-          <w:sz w:val="24"/>
-          <w:szCs w:val="24"/>
-          <w:u w:val="none"/>
-          <w:rtl w:val="0"/>
-        </w:rPr>
-        <w:t xml:space="preserve">50 total instead)</w:t>
+        <w:t xml:space="preserve">Head to Ardougne general store (Aemad’s Adventuring Supplies), buy 3 ropes, 1 water-filled vial pack, 30 balls of wool, 7 papyrus. Restore your prayer at the East Ardougne church, check your insured pets at Probita, buy two silver bars from the Silver Merchant (hop worlds once). Steal </w:t>
+      </w:r>
+      <w:r>
+        <w:rPr>
+          <w:rtl w:val="0"/>
+        </w:rPr>
+        <w:t xml:space="preserve">food to bank at least</w:t>
+      </w:r>
+      <w:r>
+        <w:rPr>
+          <w:b w:val="0"/>
+          <w:bCs w:val="0"/>
+          <w:i w:val="0"/>
+          <w:iCs w:val="0"/>
+          <w:strike w:val="0"/>
+          <w:sz w:val="24"/>
+          <w:szCs w:val="24"/>
+          <w:u w:val="none"/>
+          <w:rtl w:val="0"/>
+        </w:rPr>
+        <w:t xml:space="preserve"> 14 bread and as many cakes as you</w:t>
+      </w:r>
+      <w:r>
+        <w:rPr>
+          <w:rtl w:val="0"/>
+        </w:rPr>
+        <w:t xml:space="preserve"> get until level 20 thieving</w:t>
       </w:r>
       <w:r>
         <w:rPr>
@@ -3319,7 +3295,7 @@
         <w:rPr>
           <w:rtl w:val="0"/>
         </w:rPr>
-        <w:t xml:space="preserve">, depositing items (not the raw meat!) in the deposit box near the Entrana monks if you need inventory space. B</w:t>
+        <w:t xml:space="preserve">, depositing items (not the raw meat!) in the deposit box at the Musa Point sailors if you need inventory space. B</w:t>
       </w:r>
       <w:r>
         <w:rPr>
@@ -4756,7 +4732,7 @@
           <w:u w:val="none"/>
           <w:rtl w:val="0"/>
         </w:rPr>
-        <w:t xml:space="preserve">Go to the Varrock East bank. Grab a bucket of milk, raw sardine, doogle leaves, steel axe, chronicle, 3650 gp, waxwood logs, knife and </w:t>
+        <w:t xml:space="preserve">Go to the Varrock East bank. Grab your steel axe, forestry kit, tinderbox, knife and </w:t>
       </w:r>
       <w:r>
         <w:rPr>
@@ -4802,575 +4778,7 @@
         <w:rPr>
           <w:rtl w:val="0"/>
         </w:rPr>
-        <w:t xml:space="preserve">east and speak with Regulus Cento to take the quetzal to Varlamore. Travel back to Varrock via quetzal and run north to the sawmill</w:t>
-      </w:r>
-      <w:r>
-        <w:rPr>
-          <w:b w:val="0"/>
-          <w:bCs w:val="0"/>
-          <w:i w:val="0"/>
-          <w:iCs w:val="0"/>
-          <w:strike w:val="0"/>
-          <w:sz w:val="24"/>
-          <w:szCs w:val="24"/>
-          <w:u w:val="none"/>
-          <w:rtl w:val="0"/>
-        </w:rPr>
-        <w:t xml:space="preserve">. Enter the Lumber Yard, proceed with Gertrude's Cat until the cat goes home. Chop down a dying tree. Make the logs into a plank, buy 5 bolts of cloth and 100 steel nails, turn the waxwood logs into planks. Head east and start Rag and Bone Man I. Teleport using the chronicle, speak to Gertrude and complete the quest. Speak with Juliet. Go to the bank and </w:t>
-      </w:r>
-      <w:r>
-        <w:rPr>
-          <w:rtl w:val="0"/>
-        </w:rPr>
-        <w:t xml:space="preserve">grab a saw</w:t>
-      </w:r>
-      <w:r>
-        <w:rPr>
-          <w:b w:val="0"/>
-          <w:bCs w:val="0"/>
-          <w:i w:val="0"/>
-          <w:iCs w:val="0"/>
-          <w:strike w:val="0"/>
-          <w:sz w:val="24"/>
-          <w:szCs w:val="24"/>
-          <w:u w:val="none"/>
-          <w:rtl w:val="0"/>
-        </w:rPr>
-        <w:t xml:space="preserve">, hammer, 10 planks, 5 bolts of cloth, 3 waxwood logs, Julia’s letter and your steel nails. Give the letter to Romeo. Go to Old Man Yarlo and fix his house. Go to Marlo and complete Daddy’s Home, enter the church and speak with Father Lawrence to progress Romeo &amp; Juliet.</w:t>
-      </w:r>
-      <w:r>
-        <w:rPr>
-          <w:rtl w:val="0"/>
-        </w:rPr>
-      </w:r>
-    </w:p>
-    <w:p>
-      <w:pPr>
-        <w:jc w:val="left"/>
-        <w:rPr/>
-      </w:pPr>
-      <w:r>
-        <w:rPr>
-          <w:b w:val="1"/>
-          <w:bCs w:val="1"/>
-          <w:i w:val="0"/>
-          <w:iCs w:val="0"/>
-          <w:strike w:val="0"/>
-          <w:color w:val="8d1d75"/>
-          <w:sz w:val="24"/>
-          <w:szCs w:val="24"/>
-          <w:u w:val="none"/>
-          <w:rtl w:val="0"/>
-        </w:rPr>
-        <w:t xml:space="preserve">GP stack:</w:t>
-      </w:r>
-      <w:r>
-        <w:rPr>
-          <w:b w:val="0"/>
-          <w:bCs w:val="0"/>
-          <w:i w:val="0"/>
-          <w:iCs w:val="0"/>
-          <w:strike w:val="0"/>
-          <w:color w:val="8d1d75"/>
-          <w:sz w:val="24"/>
-          <w:szCs w:val="24"/>
-          <w:u w:val="none"/>
-          <w:rtl w:val="0"/>
-        </w:rPr>
-        <w:t xml:space="preserve"> </w:t>
-      </w:r>
-      <w:r>
-        <w:rPr>
-          <w:color w:val="8d1d75"/>
-          <w:rtl w:val="0"/>
-        </w:rPr>
-        <w:t xml:space="preserve">333</w:t>
-      </w:r>
-      <w:r>
-        <w:rPr>
-          <w:b w:val="0"/>
-          <w:bCs w:val="0"/>
-          <w:i w:val="0"/>
-          <w:iCs w:val="0"/>
-          <w:strike w:val="0"/>
-          <w:color w:val="8d1d75"/>
-          <w:sz w:val="24"/>
-          <w:szCs w:val="24"/>
-          <w:u w:val="none"/>
-          <w:rtl w:val="0"/>
-        </w:rPr>
-        <w:t xml:space="preserve"> gp </w:t>
-      </w:r>
-      <w:r>
-        <w:rPr>
-          <w:rtl w:val="0"/>
-        </w:rPr>
-      </w:r>
-    </w:p>
-    <w:p>
-      <w:pPr>
-        <w:jc w:val="left"/>
-        <w:rPr/>
-      </w:pPr>
-      <w:r>
-        <w:rPr>
-          <w:b w:val="1"/>
-          <w:bCs w:val="1"/>
-          <w:i w:val="0"/>
-          <w:iCs w:val="0"/>
-          <w:strike w:val="0"/>
-          <w:color w:val="8d1d75"/>
-          <w:sz w:val="24"/>
-          <w:szCs w:val="24"/>
-          <w:u w:val="none"/>
-          <w:rtl w:val="0"/>
-        </w:rPr>
-        <w:t xml:space="preserve">Items needed: </w:t>
-      </w:r>
-      <w:r>
-        <w:rPr>
-          <w:b w:val="0"/>
-          <w:bCs w:val="0"/>
-          <w:i w:val="0"/>
-          <w:iCs w:val="0"/>
-          <w:strike w:val="0"/>
-          <w:color w:val="8d1d75"/>
-          <w:sz w:val="24"/>
-          <w:szCs w:val="24"/>
-          <w:u w:val="none"/>
-          <w:rtl w:val="0"/>
-        </w:rPr>
-        <w:t xml:space="preserve">3650 gp, Chronicle, bucket of milk, raw sardine, doogle leaves, steel axe, wax logs</w:t>
-      </w:r>
-      <w:r>
-        <w:rPr>
-          <w:rtl w:val="0"/>
-        </w:rPr>
-      </w:r>
-    </w:p>
-    <w:p>
-      <w:pPr>
-        <w:jc w:val="left"/>
-        <w:rPr>
-          <w:color w:val="8d1d75"/>
-        </w:rPr>
-      </w:pPr>
-      <w:r>
-        <w:rPr>
-          <w:b w:val="1"/>
-          <w:bCs w:val="1"/>
-          <w:i w:val="0"/>
-          <w:iCs w:val="0"/>
-          <w:strike w:val="0"/>
-          <w:color w:val="8d1d75"/>
-          <w:sz w:val="24"/>
-          <w:szCs w:val="24"/>
-          <w:u w:val="none"/>
-          <w:rtl w:val="0"/>
-        </w:rPr>
-        <w:t xml:space="preserve">Skills/quests met?:</w:t>
-      </w:r>
-      <w:r>
-        <w:rPr>
-          <w:b w:val="0"/>
-          <w:bCs w:val="0"/>
-          <w:i w:val="0"/>
-          <w:iCs w:val="0"/>
-          <w:strike w:val="0"/>
-          <w:color w:val="8d1d75"/>
-          <w:sz w:val="24"/>
-          <w:szCs w:val="24"/>
-          <w:u w:val="none"/>
-          <w:rtl w:val="0"/>
-        </w:rPr>
-        <w:t xml:space="preserve"> yes</w:t>
-      </w:r>
-      <w:r>
-        <w:rPr>
-          <w:rtl w:val="0"/>
-        </w:rPr>
-      </w:r>
-    </w:p>
-    <w:p>
-      <w:pPr>
-        <w:jc w:val="left"/>
-        <w:rPr>
-          <w:b w:val="0"/>
-          <w:bCs w:val="0"/>
-          <w:i w:val="0"/>
-          <w:iCs w:val="0"/>
-          <w:strike w:val="0"/>
-          <w:color w:val="8d1d75"/>
-          <w:sz w:val="24"/>
-          <w:szCs w:val="24"/>
-          <w:u w:val="none"/>
-        </w:rPr>
-      </w:pPr>
-      <w:r>
-        <w:rPr>
-          <w:b w:val="0"/>
-          <w:bCs w:val="0"/>
-          <w:i w:val="0"/>
-          <w:iCs w:val="0"/>
-          <w:strike w:val="0"/>
-          <w:color w:val="8d1d75"/>
-          <w:sz w:val="24"/>
-          <w:szCs w:val="24"/>
-          <w:u w:val="none"/>
-          <w:rtl w:val="0"/>
-        </w:rPr>
-        <w:t xml:space="preserve">Total time: 7h21m</w:t>
-      </w:r>
-    </w:p>
-    <w:p>
-      <w:pPr>
-        <w:numPr>
-          <w:ilvl w:val="0"/>
-          <w:numId w:val="1"/>
-        </w:numPr>
-        <w:ind w:left="720" w:hanging="360"/>
-        <w:jc w:val="left"/>
-        <w:rPr/>
-      </w:pPr>
-      <w:r>
-        <w:rPr>
-          <w:b w:val="0"/>
-          <w:bCs w:val="0"/>
-          <w:i w:val="0"/>
-          <w:iCs w:val="0"/>
-          <w:strike w:val="0"/>
-          <w:sz w:val="24"/>
-          <w:szCs w:val="24"/>
-          <w:u w:val="none"/>
-          <w:rtl w:val="0"/>
-        </w:rPr>
-        <w:t xml:space="preserve">Bank, grab your hammer, saw, steel nails, one POH tab, GP, burnt meat, eye of newt, onion, 18 planks, 5 noted bolts of cloth and 5 noted planks (so there are 3 planks left in your bank). Break the POH tab and use your planks to train construction (6 wooden chairs, unnote your planks and cloth at Phials, 1 crude wooden chair, 1 b</w:t>
-      </w:r>
-      <w:r>
-        <w:rPr>
-          <w:rtl w:val="0"/>
-        </w:rPr>
-        <w:t xml:space="preserve">rown</w:t>
-      </w:r>
-      <w:r>
-        <w:rPr>
-          <w:b w:val="0"/>
-          <w:bCs w:val="0"/>
-          <w:i w:val="0"/>
-          <w:iCs w:val="0"/>
-          <w:strike w:val="0"/>
-          <w:sz w:val="24"/>
-          <w:szCs w:val="24"/>
-          <w:u w:val="none"/>
-          <w:rtl w:val="0"/>
-        </w:rPr>
-        <w:t xml:space="preserve"> rug and 1 torn curtains). Talk to Hetty to start Witch’s Potion, kill a rat</w:t>
-      </w:r>
-      <w:r>
-        <w:rPr>
-          <w:rtl w:val="0"/>
-        </w:rPr>
-        <w:t xml:space="preserve">, then </w:t>
-      </w:r>
-      <w:r>
-        <w:rPr>
-          <w:b w:val="0"/>
-          <w:bCs w:val="0"/>
-          <w:i w:val="0"/>
-          <w:iCs w:val="0"/>
-          <w:strike w:val="0"/>
-          <w:sz w:val="24"/>
-          <w:szCs w:val="24"/>
-          <w:u w:val="none"/>
-          <w:rtl w:val="0"/>
-        </w:rPr>
-        <w:t xml:space="preserve">return to Hetty complete </w:t>
-      </w:r>
-      <w:r>
-        <w:rPr>
-          <w:rtl w:val="0"/>
-        </w:rPr>
-        <w:t xml:space="preserve">Witch’s Potion.</w:t>
-      </w:r>
-    </w:p>
-    <w:p>
-      <w:pPr>
-        <w:jc w:val="left"/>
-        <w:rPr/>
-      </w:pPr>
-      <w:r>
-        <w:rPr>
-          <w:b w:val="1"/>
-          <w:bCs w:val="1"/>
-          <w:i w:val="0"/>
-          <w:iCs w:val="0"/>
-          <w:strike w:val="0"/>
-          <w:color w:val="8d1d75"/>
-          <w:sz w:val="24"/>
-          <w:szCs w:val="24"/>
-          <w:u w:val="none"/>
-          <w:rtl w:val="0"/>
-        </w:rPr>
-        <w:t xml:space="preserve">GP stack:</w:t>
-      </w:r>
-      <w:r>
-        <w:rPr>
-          <w:b w:val="0"/>
-          <w:bCs w:val="0"/>
-          <w:i w:val="0"/>
-          <w:iCs w:val="0"/>
-          <w:strike w:val="0"/>
-          <w:color w:val="8d1d75"/>
-          <w:sz w:val="24"/>
-          <w:szCs w:val="24"/>
-          <w:u w:val="none"/>
-          <w:rtl w:val="0"/>
-        </w:rPr>
-        <w:t xml:space="preserve"> </w:t>
-      </w:r>
-      <w:r>
-        <w:rPr>
-          <w:color w:val="8d1d75"/>
-          <w:rtl w:val="0"/>
-        </w:rPr>
-        <w:t xml:space="preserve">333</w:t>
-      </w:r>
-      <w:r>
-        <w:rPr>
-          <w:b w:val="0"/>
-          <w:bCs w:val="0"/>
-          <w:i w:val="0"/>
-          <w:iCs w:val="0"/>
-          <w:strike w:val="0"/>
-          <w:color w:val="8d1d75"/>
-          <w:sz w:val="24"/>
-          <w:szCs w:val="24"/>
-          <w:u w:val="none"/>
-          <w:rtl w:val="0"/>
-        </w:rPr>
-        <w:t xml:space="preserve"> gp</w:t>
-      </w:r>
-      <w:r>
-        <w:rPr>
-          <w:rtl w:val="0"/>
-        </w:rPr>
-      </w:r>
-    </w:p>
-    <w:p>
-      <w:pPr>
-        <w:jc w:val="left"/>
-        <w:rPr/>
-      </w:pPr>
-      <w:r>
-        <w:rPr>
-          <w:b w:val="1"/>
-          <w:bCs w:val="1"/>
-          <w:i w:val="0"/>
-          <w:iCs w:val="0"/>
-          <w:strike w:val="0"/>
-          <w:color w:val="8d1d75"/>
-          <w:sz w:val="24"/>
-          <w:szCs w:val="24"/>
-          <w:u w:val="none"/>
-          <w:rtl w:val="0"/>
-        </w:rPr>
-        <w:t xml:space="preserve">Items needed:</w:t>
-      </w:r>
-      <w:r>
-        <w:rPr>
-          <w:b w:val="0"/>
-          <w:bCs w:val="0"/>
-          <w:i w:val="0"/>
-          <w:iCs w:val="0"/>
-          <w:strike w:val="0"/>
-          <w:color w:val="8d1d75"/>
-          <w:sz w:val="24"/>
-          <w:szCs w:val="24"/>
-          <w:u w:val="none"/>
-          <w:rtl w:val="0"/>
-        </w:rPr>
-        <w:t xml:space="preserve"> saw, hammer, 86 steel nails, POH tab, burnt meat, eye of newt, onion, 100 air/mind runes, 5 bolts of cloth, 5 noted planks, 50gp</w:t>
-      </w:r>
-      <w:r>
-        <w:rPr>
-          <w:rtl w:val="0"/>
-        </w:rPr>
-      </w:r>
-    </w:p>
-    <w:p>
-      <w:pPr>
-        <w:jc w:val="left"/>
-        <w:rPr>
-          <w:color w:val="8d1d75"/>
-        </w:rPr>
-      </w:pPr>
-      <w:r>
-        <w:rPr>
-          <w:b w:val="1"/>
-          <w:bCs w:val="1"/>
-          <w:i w:val="0"/>
-          <w:iCs w:val="0"/>
-          <w:strike w:val="0"/>
-          <w:color w:val="8d1d75"/>
-          <w:sz w:val="24"/>
-          <w:szCs w:val="24"/>
-          <w:u w:val="none"/>
-          <w:rtl w:val="0"/>
-        </w:rPr>
-        <w:t xml:space="preserve">Skills/quests met?:</w:t>
-      </w:r>
-      <w:r>
-        <w:rPr>
-          <w:b w:val="0"/>
-          <w:bCs w:val="0"/>
-          <w:i w:val="0"/>
-          <w:iCs w:val="0"/>
-          <w:strike w:val="0"/>
-          <w:color w:val="8d1d75"/>
-          <w:sz w:val="24"/>
-          <w:szCs w:val="24"/>
-          <w:u w:val="none"/>
-          <w:rtl w:val="0"/>
-        </w:rPr>
-        <w:t xml:space="preserve"> yes</w:t>
-      </w:r>
-      <w:r>
-        <w:rPr>
-          <w:rtl w:val="0"/>
-        </w:rPr>
-      </w:r>
-    </w:p>
-    <w:p>
-      <w:pPr>
-        <w:jc w:val="left"/>
-        <w:rPr>
-          <w:b w:val="0"/>
-          <w:bCs w:val="0"/>
-          <w:i w:val="0"/>
-          <w:iCs w:val="0"/>
-          <w:strike w:val="0"/>
-          <w:color w:val="8d1d75"/>
-          <w:sz w:val="24"/>
-          <w:szCs w:val="24"/>
-          <w:u w:val="none"/>
-        </w:rPr>
-      </w:pPr>
-      <w:r>
-        <w:rPr>
-          <w:b w:val="0"/>
-          <w:bCs w:val="0"/>
-          <w:i w:val="0"/>
-          <w:iCs w:val="0"/>
-          <w:strike w:val="0"/>
-          <w:color w:val="8d1d75"/>
-          <w:sz w:val="24"/>
-          <w:szCs w:val="24"/>
-          <w:u w:val="none"/>
-          <w:rtl w:val="0"/>
-        </w:rPr>
-        <w:t xml:space="preserve">Total time: 8h07m</w:t>
-      </w:r>
-    </w:p>
-    <w:p>
-      <w:pPr>
-        <w:numPr>
-          <w:ilvl w:val="0"/>
-          <w:numId w:val="1"/>
-        </w:numPr>
-        <w:ind w:left="720" w:hanging="360"/>
-        <w:jc w:val="left"/>
-        <w:rPr/>
-      </w:pPr>
-      <w:r>
-        <w:rPr>
-          <w:b w:val="0"/>
-          <w:bCs w:val="0"/>
-          <w:i w:val="0"/>
-          <w:iCs w:val="0"/>
-          <w:strike w:val="0"/>
-          <w:sz w:val="24"/>
-          <w:szCs w:val="24"/>
-          <w:u w:val="none"/>
-          <w:rtl w:val="0"/>
-        </w:rPr>
-        <w:t xml:space="preserve">Miniga</w:t>
-      </w:r>
-      <w:r>
-        <w:rPr>
-          <w:b w:val="0"/>
-          <w:bCs w:val="0"/>
-          <w:i w:val="0"/>
-          <w:iCs w:val="0"/>
-          <w:strike w:val="0"/>
-          <w:color w:val="000000"/>
-          <w:sz w:val="24"/>
-          <w:szCs w:val="24"/>
-          <w:u w:val="none"/>
-          <w:rtl w:val="0"/>
-        </w:rPr>
-        <w:t xml:space="preserve">me teleport to Soul Wars. Chop teak logs on a f</w:t>
-      </w:r>
-      <w:r>
-        <w:rPr>
-          <w:rtl w:val="0"/>
-        </w:rPr>
-        <w:t xml:space="preserve">orestry world</w:t>
-      </w:r>
-      <w:r>
-        <w:rPr>
-          <w:b w:val="0"/>
-          <w:bCs w:val="0"/>
-          <w:i w:val="0"/>
-          <w:iCs w:val="0"/>
-          <w:strike w:val="0"/>
-          <w:color w:val="000000"/>
-          <w:sz w:val="24"/>
-          <w:szCs w:val="24"/>
-          <w:u w:val="none"/>
-          <w:rtl w:val="0"/>
-        </w:rPr>
-        <w:t xml:space="preserve"> - world 444</w:t>
-      </w:r>
-      <w:r>
-        <w:rPr>
-          <w:rtl w:val="0"/>
-        </w:rPr>
-        <w:t xml:space="preserve"> is recommended as it is usually the most popular - </w:t>
-      </w:r>
-      <w:r>
-        <w:rPr>
-          <w:b w:val="0"/>
-          <w:bCs w:val="0"/>
-          <w:i w:val="0"/>
-          <w:iCs w:val="0"/>
-          <w:strike w:val="0"/>
-          <w:color w:val="000000"/>
-          <w:sz w:val="24"/>
-          <w:szCs w:val="24"/>
-          <w:u w:val="none"/>
-          <w:rtl w:val="0"/>
-        </w:rPr>
-        <w:t xml:space="preserve">and burn them to level 50 firemaking </w:t>
-      </w:r>
-      <w:r>
-        <w:rPr>
-          <w:b w:val="0"/>
-          <w:bCs w:val="0"/>
-          <w:i w:val="1"/>
-          <w:iCs w:val="1"/>
-          <w:strike w:val="0"/>
-          <w:color w:val="000000"/>
-          <w:sz w:val="24"/>
-          <w:szCs w:val="24"/>
-          <w:u w:val="none"/>
-          <w:rtl w:val="0"/>
-        </w:rPr>
-        <w:t xml:space="preserve">(note: it would theoretically be faster to 2t, but the birds will actually just kill you at your current stats).</w:t>
-      </w:r>
-      <w:r>
-        <w:rPr>
-          <w:rtl w:val="0"/>
-        </w:rPr>
+        <w:t xml:space="preserve">east and speak with Regulus Cento to take the quetzal to Varlamore. Travel south, start and complete The Ribbiting Tale of a Lily Pad Labour Dispute, then chop and burn teak logs to level 50 firemaking on a forestry world (world 444 recommended).</w:t>
       </w:r>
     </w:p>
     <w:p>
@@ -5380,10 +4788,6 @@
           <w:numId w:val="1"/>
         </w:numPr>
         <w:ind w:left="1080" w:hanging="360"/>
-        <w:jc w:val="left"/>
-        <w:rPr>
-          <w:u w:val="none"/>
-        </w:rPr>
       </w:pPr>
       <w:r>
         <w:rPr>
@@ -5410,96 +4814,58 @@
     </w:p>
     <w:p>
       <w:pPr>
-        <w:jc w:val="left"/>
         <w:rPr/>
       </w:pPr>
       <w:r>
         <w:rPr>
           <w:b w:val="1"/>
           <w:bCs w:val="1"/>
-          <w:i w:val="0"/>
-          <w:iCs w:val="0"/>
-          <w:strike w:val="0"/>
-          <w:color w:val="8d1d75"/>
-          <w:sz w:val="24"/>
-          <w:szCs w:val="24"/>
-          <w:u w:val="none"/>
-          <w:rtl w:val="0"/>
-        </w:rPr>
-        <w:t xml:space="preserve">GP stack: </w:t>
-      </w:r>
-      <w:r>
-        <w:rPr>
-          <w:color w:val="8d1d75"/>
-          <w:rtl w:val="0"/>
-        </w:rPr>
-        <w:t xml:space="preserve">333</w:t>
-      </w:r>
-      <w:r>
-        <w:rPr>
-          <w:b w:val="0"/>
-          <w:bCs w:val="0"/>
-          <w:i w:val="0"/>
-          <w:iCs w:val="0"/>
-          <w:strike w:val="0"/>
-          <w:color w:val="8d1d75"/>
-          <w:sz w:val="24"/>
-          <w:szCs w:val="24"/>
-          <w:u w:val="none"/>
-          <w:rtl w:val="0"/>
-        </w:rPr>
-        <w:t xml:space="preserve"> gp</w:t>
-      </w:r>
-      <w:r>
-        <w:rPr>
-          <w:rtl w:val="0"/>
-        </w:rPr>
-      </w:r>
-    </w:p>
-    <w:p>
-      <w:pPr>
-        <w:jc w:val="left"/>
+          <w:color w:val="8d1d75"/>
+          <w:rtl w:val="0"/>
+        </w:rPr>
+        <w:t xml:space="preserve">GP stack:</w:t>
+      </w:r>
+      <w:r>
+        <w:rPr>
+          <w:color w:val="8d1d75"/>
+          <w:rtl w:val="0"/>
+        </w:rPr>
+        <w:t xml:space="preserve"> 3983 gp</w:t>
+      </w:r>
+      <w:r>
+        <w:rPr>
+          <w:rtl w:val="0"/>
+        </w:rPr>
+      </w:r>
+    </w:p>
+    <w:p>
+      <w:pPr>
         <w:rPr/>
       </w:pPr>
       <w:r>
         <w:rPr>
           <w:b w:val="1"/>
           <w:bCs w:val="1"/>
-          <w:i w:val="0"/>
-          <w:iCs w:val="0"/>
-          <w:strike w:val="0"/>
-          <w:color w:val="8d1d75"/>
-          <w:sz w:val="24"/>
-          <w:szCs w:val="24"/>
-          <w:u w:val="none"/>
-          <w:rtl w:val="0"/>
-        </w:rPr>
-        <w:t xml:space="preserve">Items needed:</w:t>
-      </w:r>
-      <w:r>
-        <w:rPr>
-          <w:b w:val="0"/>
-          <w:bCs w:val="0"/>
-          <w:i w:val="0"/>
-          <w:iCs w:val="0"/>
-          <w:strike w:val="0"/>
-          <w:color w:val="8d1d75"/>
-          <w:sz w:val="24"/>
-          <w:szCs w:val="24"/>
-          <w:u w:val="none"/>
-          <w:rtl w:val="0"/>
-        </w:rPr>
-        <w:t xml:space="preserve"> steel axe, tinderbox, forestry kit</w:t>
-      </w:r>
-      <w:r>
-        <w:rPr>
-          <w:rtl w:val="0"/>
-        </w:rPr>
-      </w:r>
-    </w:p>
-    <w:p>
-      <w:pPr>
-        <w:jc w:val="left"/>
+          <w:color w:val="8d1d75"/>
+          <w:rtl w:val="0"/>
+        </w:rPr>
+        <w:t xml:space="preserve">Items needed: </w:t>
+      </w:r>
+      <w:r>
+        <w:rPr>
+          <w:color w:val="8d1d75"/>
+          <w:rtl w:val="0"/>
+        </w:rPr>
+        <w:t xml:space="preserve">steel axe, knife, logs, tinderbox, forestry kit</w:t>
+      </w:r>
+      <w:r>
+        <w:rPr>
+          <w:rtl w:val="0"/>
+        </w:rPr>
+      </w:r>
+    </w:p>
+    <w:p>
+      <w:pPr>
         <w:rPr>
           <w:color w:val="8d1d75"/>
         </w:rPr>
@@ -5508,67 +4874,573 @@
         <w:rPr>
           <w:b w:val="1"/>
           <w:bCs w:val="1"/>
-          <w:i w:val="0"/>
-          <w:iCs w:val="0"/>
-          <w:strike w:val="0"/>
-          <w:color w:val="8d1d75"/>
-          <w:sz w:val="24"/>
-          <w:szCs w:val="24"/>
-          <w:u w:val="none"/>
+          <w:color w:val="8d1d75"/>
           <w:rtl w:val="0"/>
         </w:rPr>
         <w:t xml:space="preserve">Skills/quests met?:</w:t>
       </w:r>
       <w:r>
         <w:rPr>
-          <w:b w:val="0"/>
-          <w:bCs w:val="0"/>
-          <w:i w:val="0"/>
-          <w:iCs w:val="0"/>
-          <w:strike w:val="0"/>
-          <w:color w:val="8d1d75"/>
-          <w:sz w:val="24"/>
-          <w:szCs w:val="24"/>
-          <w:u w:val="none"/>
+          <w:color w:val="8d1d75"/>
           <w:rtl w:val="0"/>
         </w:rPr>
         <w:t xml:space="preserve"> yes</w:t>
       </w:r>
-      <w:r>
-        <w:rPr>
-          <w:rtl w:val="0"/>
-        </w:rPr>
-      </w:r>
-    </w:p>
-    <w:p>
-      <w:pPr>
-        <w:jc w:val="left"/>
-        <w:rPr>
-          <w:b w:val="0"/>
-          <w:bCs w:val="0"/>
-          <w:i w:val="0"/>
-          <w:iCs w:val="0"/>
-          <w:strike w:val="0"/>
-          <w:color w:val="8d1d75"/>
-          <w:sz w:val="24"/>
-          <w:szCs w:val="24"/>
-          <w:u w:val="none"/>
-        </w:rPr>
-      </w:pPr>
-      <w:r>
-        <w:rPr>
-          <w:b w:val="0"/>
-          <w:bCs w:val="0"/>
-          <w:i w:val="0"/>
-          <w:iCs w:val="0"/>
-          <w:strike w:val="0"/>
-          <w:color w:val="8d1d75"/>
-          <w:sz w:val="24"/>
-          <w:szCs w:val="24"/>
-          <w:u w:val="none"/>
-          <w:rtl w:val="0"/>
-        </w:rPr>
-        <w:t xml:space="preserve">Total time: 10h10m</w:t>
+    </w:p>
+    <w:p>
+      <w:pPr>
+        <w:rPr/>
+      </w:pPr>
+      <w:r>
+        <w:rPr>
+          <w:color w:val="8d1d75"/>
+          <w:rtl w:val="0"/>
+        </w:rPr>
+        <w:t xml:space="preserve">Total time: 9h20m</w:t>
+      </w:r>
+      <w:r>
+        <w:rPr>
+          <w:rtl w:val="0"/>
+        </w:rPr>
+      </w:r>
+    </w:p>
+    <w:p>
+      <w:pPr>
+        <w:numPr>
+          <w:ilvl w:val="0"/>
+          <w:numId w:val="1"/>
+        </w:numPr>
+        <w:ind w:left="720" w:hanging="360"/>
+        <w:jc w:val="left"/>
+        <w:rPr/>
+      </w:pPr>
+      <w:r>
+        <w:rPr>
+          <w:rtl w:val="0"/>
+        </w:rPr>
+        <w:t xml:space="preserve">Run north, grabbing a sweetcorn along the way. Travel back to Varrock via quetzal, run to the East bank. Grab a bucket of milk, raw sardine, doogle leaves, steel axe, chronicle, 3650 gp, and waxwood logs and run north to the sawmill</w:t>
+      </w:r>
+      <w:r>
+        <w:rPr>
+          <w:b w:val="0"/>
+          <w:bCs w:val="0"/>
+          <w:i w:val="0"/>
+          <w:iCs w:val="0"/>
+          <w:strike w:val="0"/>
+          <w:sz w:val="24"/>
+          <w:szCs w:val="24"/>
+          <w:u w:val="none"/>
+          <w:rtl w:val="0"/>
+        </w:rPr>
+        <w:t xml:space="preserve">. Enter the Lumber Yard, proceed with Gertrude's Cat until the cat goes home. Chop down a dying tree. Make the logs into a plank, buy 5 bolts of cloth and 100 steel nails, turn the waxwood logs into planks. Head east and start Rag and Bone Man I. Teleport using the chronicle, speak to Gertrude and complete the quest. Speak with Juliet. Go to the bank and </w:t>
+      </w:r>
+      <w:r>
+        <w:rPr>
+          <w:rtl w:val="0"/>
+        </w:rPr>
+        <w:t xml:space="preserve">grab a saw</w:t>
+      </w:r>
+      <w:r>
+        <w:rPr>
+          <w:b w:val="0"/>
+          <w:bCs w:val="0"/>
+          <w:i w:val="0"/>
+          <w:iCs w:val="0"/>
+          <w:strike w:val="0"/>
+          <w:sz w:val="24"/>
+          <w:szCs w:val="24"/>
+          <w:u w:val="none"/>
+          <w:rtl w:val="0"/>
+        </w:rPr>
+        <w:t xml:space="preserve">, hammer, 10 planks, 5 bolts of cloth, 3 waxwood logs, Julia’s letter and your steel nails. Give the letter to Romeo. Go to Old Man Yarlo and fix his house. Go to Marlo and complete Daddy’s Home, enter the church and speak with Father Lawrence to progress Romeo &amp; Juliet.</w:t>
+      </w:r>
+      <w:r>
+        <w:rPr>
+          <w:rtl w:val="0"/>
+        </w:rPr>
+      </w:r>
+    </w:p>
+    <w:p>
+      <w:pPr>
+        <w:jc w:val="left"/>
+        <w:rPr/>
+      </w:pPr>
+      <w:r>
+        <w:rPr>
+          <w:b w:val="1"/>
+          <w:bCs w:val="1"/>
+          <w:i w:val="0"/>
+          <w:iCs w:val="0"/>
+          <w:strike w:val="0"/>
+          <w:color w:val="8d1d75"/>
+          <w:sz w:val="24"/>
+          <w:szCs w:val="24"/>
+          <w:u w:val="none"/>
+          <w:rtl w:val="0"/>
+        </w:rPr>
+        <w:t xml:space="preserve">GP stack:</w:t>
+      </w:r>
+      <w:r>
+        <w:rPr>
+          <w:b w:val="0"/>
+          <w:bCs w:val="0"/>
+          <w:i w:val="0"/>
+          <w:iCs w:val="0"/>
+          <w:strike w:val="0"/>
+          <w:color w:val="8d1d75"/>
+          <w:sz w:val="24"/>
+          <w:szCs w:val="24"/>
+          <w:u w:val="none"/>
+          <w:rtl w:val="0"/>
+        </w:rPr>
+        <w:t xml:space="preserve"> </w:t>
+      </w:r>
+      <w:r>
+        <w:rPr>
+          <w:color w:val="8d1d75"/>
+          <w:rtl w:val="0"/>
+        </w:rPr>
+        <w:t xml:space="preserve">333</w:t>
+      </w:r>
+      <w:r>
+        <w:rPr>
+          <w:b w:val="0"/>
+          <w:bCs w:val="0"/>
+          <w:i w:val="0"/>
+          <w:iCs w:val="0"/>
+          <w:strike w:val="0"/>
+          <w:color w:val="8d1d75"/>
+          <w:sz w:val="24"/>
+          <w:szCs w:val="24"/>
+          <w:u w:val="none"/>
+          <w:rtl w:val="0"/>
+        </w:rPr>
+        <w:t xml:space="preserve"> gp </w:t>
+      </w:r>
+      <w:r>
+        <w:rPr>
+          <w:rtl w:val="0"/>
+        </w:rPr>
+      </w:r>
+    </w:p>
+    <w:p>
+      <w:pPr>
+        <w:jc w:val="left"/>
+        <w:rPr/>
+      </w:pPr>
+      <w:r>
+        <w:rPr>
+          <w:b w:val="1"/>
+          <w:bCs w:val="1"/>
+          <w:i w:val="0"/>
+          <w:iCs w:val="0"/>
+          <w:strike w:val="0"/>
+          <w:color w:val="8d1d75"/>
+          <w:sz w:val="24"/>
+          <w:szCs w:val="24"/>
+          <w:u w:val="none"/>
+          <w:rtl w:val="0"/>
+        </w:rPr>
+        <w:t xml:space="preserve">Items needed: </w:t>
+      </w:r>
+      <w:r>
+        <w:rPr>
+          <w:b w:val="0"/>
+          <w:bCs w:val="0"/>
+          <w:i w:val="0"/>
+          <w:iCs w:val="0"/>
+          <w:strike w:val="0"/>
+          <w:color w:val="8d1d75"/>
+          <w:sz w:val="24"/>
+          <w:szCs w:val="24"/>
+          <w:u w:val="none"/>
+          <w:rtl w:val="0"/>
+        </w:rPr>
+        <w:t xml:space="preserve">3650 gp, Chronicle, bucket of milk, raw sardine, doogle leaves, steel axe, wax logs</w:t>
+      </w:r>
+      <w:r>
+        <w:rPr>
+          <w:rtl w:val="0"/>
+        </w:rPr>
+      </w:r>
+    </w:p>
+    <w:p>
+      <w:pPr>
+        <w:jc w:val="left"/>
+        <w:rPr>
+          <w:color w:val="8d1d75"/>
+        </w:rPr>
+      </w:pPr>
+      <w:r>
+        <w:rPr>
+          <w:b w:val="1"/>
+          <w:bCs w:val="1"/>
+          <w:i w:val="0"/>
+          <w:iCs w:val="0"/>
+          <w:strike w:val="0"/>
+          <w:color w:val="8d1d75"/>
+          <w:sz w:val="24"/>
+          <w:szCs w:val="24"/>
+          <w:u w:val="none"/>
+          <w:rtl w:val="0"/>
+        </w:rPr>
+        <w:t xml:space="preserve">Skills/quests met?:</w:t>
+      </w:r>
+      <w:r>
+        <w:rPr>
+          <w:b w:val="0"/>
+          <w:bCs w:val="0"/>
+          <w:i w:val="0"/>
+          <w:iCs w:val="0"/>
+          <w:strike w:val="0"/>
+          <w:color w:val="8d1d75"/>
+          <w:sz w:val="24"/>
+          <w:szCs w:val="24"/>
+          <w:u w:val="none"/>
+          <w:rtl w:val="0"/>
+        </w:rPr>
+        <w:t xml:space="preserve"> yes</w:t>
+      </w:r>
+      <w:r>
+        <w:rPr>
+          <w:rtl w:val="0"/>
+        </w:rPr>
+      </w:r>
+    </w:p>
+    <w:p>
+      <w:pPr>
+        <w:jc w:val="left"/>
+        <w:rPr>
+          <w:b w:val="0"/>
+          <w:bCs w:val="0"/>
+          <w:i w:val="0"/>
+          <w:iCs w:val="0"/>
+          <w:strike w:val="0"/>
+          <w:color w:val="8d1d75"/>
+          <w:sz w:val="24"/>
+          <w:szCs w:val="24"/>
+          <w:u w:val="none"/>
+        </w:rPr>
+      </w:pPr>
+      <w:r>
+        <w:rPr>
+          <w:b w:val="0"/>
+          <w:bCs w:val="0"/>
+          <w:i w:val="0"/>
+          <w:iCs w:val="0"/>
+          <w:strike w:val="0"/>
+          <w:color w:val="8d1d75"/>
+          <w:sz w:val="24"/>
+          <w:szCs w:val="24"/>
+          <w:u w:val="none"/>
+          <w:rtl w:val="0"/>
+        </w:rPr>
+        <w:t xml:space="preserve">Total time: </w:t>
+      </w:r>
+      <w:r>
+        <w:rPr>
+          <w:color w:val="8d1d75"/>
+          <w:rtl w:val="0"/>
+        </w:rPr>
+        <w:t xml:space="preserve">9</w:t>
+      </w:r>
+      <w:r>
+        <w:rPr>
+          <w:b w:val="0"/>
+          <w:bCs w:val="0"/>
+          <w:i w:val="0"/>
+          <w:iCs w:val="0"/>
+          <w:strike w:val="0"/>
+          <w:color w:val="8d1d75"/>
+          <w:sz w:val="24"/>
+          <w:szCs w:val="24"/>
+          <w:u w:val="none"/>
+          <w:rtl w:val="0"/>
+        </w:rPr>
+        <w:t xml:space="preserve">h</w:t>
+      </w:r>
+      <w:r>
+        <w:rPr>
+          <w:color w:val="8d1d75"/>
+          <w:rtl w:val="0"/>
+        </w:rPr>
+        <w:t xml:space="preserve">44</w:t>
+      </w:r>
+      <w:r>
+        <w:rPr>
+          <w:b w:val="0"/>
+          <w:bCs w:val="0"/>
+          <w:i w:val="0"/>
+          <w:iCs w:val="0"/>
+          <w:strike w:val="0"/>
+          <w:color w:val="8d1d75"/>
+          <w:sz w:val="24"/>
+          <w:szCs w:val="24"/>
+          <w:u w:val="none"/>
+          <w:rtl w:val="0"/>
+        </w:rPr>
+        <w:t xml:space="preserve">m</w:t>
+      </w:r>
+    </w:p>
+    <w:p>
+      <w:pPr>
+        <w:numPr>
+          <w:ilvl w:val="0"/>
+          <w:numId w:val="1"/>
+        </w:numPr>
+        <w:ind w:left="720" w:hanging="360"/>
+        <w:jc w:val="left"/>
+        <w:rPr/>
+      </w:pPr>
+      <w:r>
+        <w:rPr>
+          <w:b w:val="0"/>
+          <w:bCs w:val="0"/>
+          <w:i w:val="0"/>
+          <w:iCs w:val="0"/>
+          <w:strike w:val="0"/>
+          <w:sz w:val="24"/>
+          <w:szCs w:val="24"/>
+          <w:u w:val="none"/>
+          <w:rtl w:val="0"/>
+        </w:rPr>
+        <w:t xml:space="preserve">Bank, grab your hammer, saw, steel nails, one POH tab, GP, burnt meat, eye of newt, onion, 18 planks, 5 noted bolts of cloth and 5 noted planks (so there are 3 planks left in your bank). Break the POH tab and use your planks to train construction (6 wooden chairs, unnote your planks and cloth at Phials, 1 crude wooden chair, 1 b</w:t>
+      </w:r>
+      <w:r>
+        <w:rPr>
+          <w:rtl w:val="0"/>
+        </w:rPr>
+        <w:t xml:space="preserve">rown</w:t>
+      </w:r>
+      <w:r>
+        <w:rPr>
+          <w:b w:val="0"/>
+          <w:bCs w:val="0"/>
+          <w:i w:val="0"/>
+          <w:iCs w:val="0"/>
+          <w:strike w:val="0"/>
+          <w:sz w:val="24"/>
+          <w:szCs w:val="24"/>
+          <w:u w:val="none"/>
+          <w:rtl w:val="0"/>
+        </w:rPr>
+        <w:t xml:space="preserve"> rug and 1 torn curtains). Talk to Hetty to start Witch’s Potion, kill a rat</w:t>
+      </w:r>
+      <w:r>
+        <w:rPr>
+          <w:rtl w:val="0"/>
+        </w:rPr>
+        <w:t xml:space="preserve">, then </w:t>
+      </w:r>
+      <w:r>
+        <w:rPr>
+          <w:b w:val="0"/>
+          <w:bCs w:val="0"/>
+          <w:i w:val="0"/>
+          <w:iCs w:val="0"/>
+          <w:strike w:val="0"/>
+          <w:sz w:val="24"/>
+          <w:szCs w:val="24"/>
+          <w:u w:val="none"/>
+          <w:rtl w:val="0"/>
+        </w:rPr>
+        <w:t xml:space="preserve">return to Hetty complete </w:t>
+      </w:r>
+      <w:r>
+        <w:rPr>
+          <w:rtl w:val="0"/>
+        </w:rPr>
+        <w:t xml:space="preserve">Witch’s Potion.</w:t>
+      </w:r>
+    </w:p>
+    <w:p>
+      <w:pPr>
+        <w:jc w:val="left"/>
+        <w:rPr/>
+      </w:pPr>
+      <w:r>
+        <w:rPr>
+          <w:b w:val="1"/>
+          <w:bCs w:val="1"/>
+          <w:i w:val="0"/>
+          <w:iCs w:val="0"/>
+          <w:strike w:val="0"/>
+          <w:color w:val="8d1d75"/>
+          <w:sz w:val="24"/>
+          <w:szCs w:val="24"/>
+          <w:u w:val="none"/>
+          <w:rtl w:val="0"/>
+        </w:rPr>
+        <w:t xml:space="preserve">GP stack:</w:t>
+      </w:r>
+      <w:r>
+        <w:rPr>
+          <w:b w:val="0"/>
+          <w:bCs w:val="0"/>
+          <w:i w:val="0"/>
+          <w:iCs w:val="0"/>
+          <w:strike w:val="0"/>
+          <w:color w:val="8d1d75"/>
+          <w:sz w:val="24"/>
+          <w:szCs w:val="24"/>
+          <w:u w:val="none"/>
+          <w:rtl w:val="0"/>
+        </w:rPr>
+        <w:t xml:space="preserve"> </w:t>
+      </w:r>
+      <w:r>
+        <w:rPr>
+          <w:color w:val="8d1d75"/>
+          <w:rtl w:val="0"/>
+        </w:rPr>
+        <w:t xml:space="preserve">283</w:t>
+      </w:r>
+      <w:r>
+        <w:rPr>
+          <w:b w:val="0"/>
+          <w:bCs w:val="0"/>
+          <w:i w:val="0"/>
+          <w:iCs w:val="0"/>
+          <w:strike w:val="0"/>
+          <w:color w:val="8d1d75"/>
+          <w:sz w:val="24"/>
+          <w:szCs w:val="24"/>
+          <w:u w:val="none"/>
+          <w:rtl w:val="0"/>
+        </w:rPr>
+        <w:t xml:space="preserve"> gp</w:t>
+      </w:r>
+      <w:r>
+        <w:rPr>
+          <w:rtl w:val="0"/>
+        </w:rPr>
+      </w:r>
+    </w:p>
+    <w:p>
+      <w:pPr>
+        <w:jc w:val="left"/>
+        <w:rPr/>
+      </w:pPr>
+      <w:r>
+        <w:rPr>
+          <w:b w:val="1"/>
+          <w:bCs w:val="1"/>
+          <w:i w:val="0"/>
+          <w:iCs w:val="0"/>
+          <w:strike w:val="0"/>
+          <w:color w:val="8d1d75"/>
+          <w:sz w:val="24"/>
+          <w:szCs w:val="24"/>
+          <w:u w:val="none"/>
+          <w:rtl w:val="0"/>
+        </w:rPr>
+        <w:t xml:space="preserve">Items needed:</w:t>
+      </w:r>
+      <w:r>
+        <w:rPr>
+          <w:b w:val="0"/>
+          <w:bCs w:val="0"/>
+          <w:i w:val="0"/>
+          <w:iCs w:val="0"/>
+          <w:strike w:val="0"/>
+          <w:color w:val="8d1d75"/>
+          <w:sz w:val="24"/>
+          <w:szCs w:val="24"/>
+          <w:u w:val="none"/>
+          <w:rtl w:val="0"/>
+        </w:rPr>
+        <w:t xml:space="preserve"> saw, hammer, 86 steel nails, POH tab, burnt meat, eye of newt, onion, 100 air/mind runes, 5 bolts of cloth, 5 noted planks, 50gp</w:t>
+      </w:r>
+      <w:r>
+        <w:rPr>
+          <w:rtl w:val="0"/>
+        </w:rPr>
+      </w:r>
+    </w:p>
+    <w:p>
+      <w:pPr>
+        <w:jc w:val="left"/>
+        <w:rPr>
+          <w:color w:val="8d1d75"/>
+        </w:rPr>
+      </w:pPr>
+      <w:r>
+        <w:rPr>
+          <w:b w:val="1"/>
+          <w:bCs w:val="1"/>
+          <w:i w:val="0"/>
+          <w:iCs w:val="0"/>
+          <w:strike w:val="0"/>
+          <w:color w:val="8d1d75"/>
+          <w:sz w:val="24"/>
+          <w:szCs w:val="24"/>
+          <w:u w:val="none"/>
+          <w:rtl w:val="0"/>
+        </w:rPr>
+        <w:t xml:space="preserve">Skills/quests met?:</w:t>
+      </w:r>
+      <w:r>
+        <w:rPr>
+          <w:b w:val="0"/>
+          <w:bCs w:val="0"/>
+          <w:i w:val="0"/>
+          <w:iCs w:val="0"/>
+          <w:strike w:val="0"/>
+          <w:color w:val="8d1d75"/>
+          <w:sz w:val="24"/>
+          <w:szCs w:val="24"/>
+          <w:u w:val="none"/>
+          <w:rtl w:val="0"/>
+        </w:rPr>
+        <w:t xml:space="preserve"> yes</w:t>
+      </w:r>
+      <w:r>
+        <w:rPr>
+          <w:rtl w:val="0"/>
+        </w:rPr>
+      </w:r>
+    </w:p>
+    <w:p>
+      <w:pPr>
+        <w:jc w:val="left"/>
+        <w:rPr>
+          <w:b w:val="0"/>
+          <w:bCs w:val="0"/>
+          <w:i w:val="0"/>
+          <w:iCs w:val="0"/>
+          <w:strike w:val="0"/>
+          <w:color w:val="8d1d75"/>
+          <w:sz w:val="24"/>
+          <w:szCs w:val="24"/>
+          <w:u w:val="none"/>
+        </w:rPr>
+      </w:pPr>
+      <w:r>
+        <w:rPr>
+          <w:b w:val="0"/>
+          <w:bCs w:val="0"/>
+          <w:i w:val="0"/>
+          <w:iCs w:val="0"/>
+          <w:strike w:val="0"/>
+          <w:color w:val="8d1d75"/>
+          <w:sz w:val="24"/>
+          <w:szCs w:val="24"/>
+          <w:u w:val="none"/>
+          <w:rtl w:val="0"/>
+        </w:rPr>
+        <w:t xml:space="preserve">Total time: </w:t>
+      </w:r>
+      <w:r>
+        <w:rPr>
+          <w:color w:val="8d1d75"/>
+          <w:rtl w:val="0"/>
+        </w:rPr>
+        <w:t xml:space="preserve">10h10m</w:t>
+      </w:r>
+      <w:r>
+        <w:rPr>
+          <w:rtl w:val="0"/>
+        </w:rPr>
       </w:r>
     </w:p>
     <w:p>
@@ -6000,7 +5872,27 @@
           <w:u w:val="none"/>
           <w:rtl w:val="0"/>
         </w:rPr>
-        <w:t xml:space="preserve">, using the banked cakes for food. Your four warm items are the </w:t>
+        <w:t xml:space="preserve">, </w:t>
+      </w:r>
+      <w:r>
+        <w:rPr>
+          <w:rtl w:val="0"/>
+        </w:rPr>
+        <w:t xml:space="preserve">making bruma potions inside the game for warmth (do not use your banked cakes)</w:t>
+      </w:r>
+      <w:r>
+        <w:rPr>
+          <w:b w:val="0"/>
+          <w:bCs w:val="0"/>
+          <w:i w:val="0"/>
+          <w:iCs w:val="0"/>
+          <w:strike w:val="0"/>
+          <w:sz w:val="24"/>
+          <w:szCs w:val="24"/>
+          <w:u w:val="none"/>
+          <w:rtl w:val="0"/>
+        </w:rPr>
+        <w:t xml:space="preserve">. Your four warm items are the </w:t>
       </w:r>
       <w:r>
         <w:rPr>
@@ -8310,7 +8202,7 @@
         <w:rPr>
           <w:rtl w:val="0"/>
         </w:rPr>
-        <w:t xml:space="preserve">east of Hosidius square to a bit over level 42 thieving (46,512 xp!)</w:t>
+        <w:t xml:space="preserve">east of Hosidius square to almost level 41 thieving (40,583 xp or higher)</w:t>
       </w:r>
       <w:r>
         <w:rPr>
@@ -14073,7 +13965,27 @@
           <w:u w:val="none"/>
           <w:rtl w:val="0"/>
         </w:rPr>
-        <w:t xml:space="preserve"> Edgeville, bank your money. Grab a knife and go to the Mage Arena. Buy </w:t>
+        <w:t xml:space="preserve"> Edgeville, make a small detour to the Dog Shelter </w:t>
+      </w:r>
+      <w:r>
+        <w:rPr>
+          <w:rtl w:val="0"/>
+        </w:rPr>
+        <w:t xml:space="preserve">to the south-west and start A Ruff Situation. Return to Edgeville, b</w:t>
+      </w:r>
+      <w:r>
+        <w:rPr>
+          <w:b w:val="0"/>
+          <w:bCs w:val="0"/>
+          <w:i w:val="0"/>
+          <w:iCs w:val="0"/>
+          <w:strike w:val="0"/>
+          <w:sz w:val="24"/>
+          <w:szCs w:val="24"/>
+          <w:u w:val="none"/>
+          <w:rtl w:val="0"/>
+        </w:rPr>
+        <w:t xml:space="preserve">ank your money. Grab a knife and go to the Mage Arena. Buy </w:t>
       </w:r>
       <w:r>
         <w:rPr>
@@ -15860,7 +15772,7 @@
           <w:u w:val="none"/>
           <w:rtl w:val="0"/>
         </w:rPr>
-        <w:t xml:space="preserve"> gown (bottom and top), a brown apron and a pink skirt from Thessalia, a newspaper from Benny</w:t>
+        <w:t xml:space="preserve"> gown (bottom and top), a brown apron and a pink skirt from Thessalia, a newspaper from Benny, (any) fur from Baraek</w:t>
       </w:r>
       <w:r>
         <w:rPr>
@@ -15899,7 +15811,47 @@
           <w:u w:val="none"/>
           <w:rtl w:val="0"/>
         </w:rPr>
-        <w:t xml:space="preserve">and a rotten tomato from the chest. Make a steak sandwich for Below Ice Mountain.</w:t>
+        <w:t xml:space="preserve">and a rotten tomato from the chest. Head west, banking to grab </w:t>
+      </w:r>
+      <w:r>
+        <w:rPr>
+          <w:rtl w:val="0"/>
+        </w:rPr>
+        <w:t xml:space="preserve">your costume needle,</w:t>
+      </w:r>
+      <w:r>
+        <w:rPr>
+          <w:b w:val="0"/>
+          <w:bCs w:val="0"/>
+          <w:i w:val="0"/>
+          <w:iCs w:val="0"/>
+          <w:strike w:val="0"/>
+          <w:sz w:val="24"/>
+          <w:szCs w:val="24"/>
+          <w:u w:val="none"/>
+          <w:rtl w:val="0"/>
+        </w:rPr>
+        <w:t xml:space="preserve"> and speak with Gertrude f</w:t>
+      </w:r>
+      <w:r>
+        <w:rPr>
+          <w:rtl w:val="0"/>
+        </w:rPr>
+        <w:t xml:space="preserve">or A Ruff Situation. Continue this quest and complete it. Teleport back to Varrock, m</w:t>
+      </w:r>
+      <w:r>
+        <w:rPr>
+          <w:b w:val="0"/>
+          <w:bCs w:val="0"/>
+          <w:i w:val="0"/>
+          <w:iCs w:val="0"/>
+          <w:strike w:val="0"/>
+          <w:sz w:val="24"/>
+          <w:szCs w:val="24"/>
+          <w:u w:val="none"/>
+          <w:rtl w:val="0"/>
+        </w:rPr>
+        <w:t xml:space="preserve">ake a steak sandwich for Below Ice Mountain.</w:t>
       </w:r>
       <w:r>
         <w:rPr>
@@ -26956,13 +26908,7 @@
           <w:u w:val="none"/>
           <w:rtl w:val="0"/>
         </w:rPr>
-        <w:t xml:space="preserve">DIS (diary step), AJP</w:t>
-      </w:r>
-      <w:r>
-        <w:rPr>
-          <w:rtl w:val="0"/>
-        </w:rPr>
-        <w:t xml:space="preserve"> (Varlamore) and do The Ribbiting Tale of a Lily Pad Labour Dispute in full and include this fairy ring in future hardwood tree farming runs, also grab a sweetcorn for Recipe for Disaster, </w:t>
+        <w:t xml:space="preserve">DIS (diary step), </w:t>
       </w:r>
       <w:r>
         <w:rPr>
@@ -26970,7 +26916,7 @@
           <w:iCs w:val="1"/>
           <w:rtl w:val="0"/>
         </w:rPr>
-        <w:t xml:space="preserve">optional: also do Twilight’s Promise here, this requires some combat</w:t>
+        <w:t xml:space="preserve">optional: AJP and do Twilight’s Promise here, this requires some combat</w:t>
       </w:r>
       <w:r>
         <w:rPr>
@@ -31406,7 +31352,7 @@
         <w:rPr>
           <w:rtl w:val="0"/>
         </w:rPr>
-        <w:t xml:space="preserve">. Bank, grab combat gear (including mithril armour, your gnome amulet and an antidragon shield), an axe, a tinderbox, a knife, money, pickaxe optional, runes optional </w:t>
+        <w:t xml:space="preserve">. Bank, grab combat gear (including mithril armour, your gnome amulet and an antidragon shield), an axe, spade, a tinderbox, a knife, money, pickaxe optional, runes optional </w:t>
       </w:r>
       <w:r>
         <w:rPr>
@@ -31443,7 +31389,7 @@
         <w:rPr>
           <w:rtl w:val="0"/>
         </w:rPr>
-        <w:t xml:space="preserve">), chop light jungle to get a gout tuber for the medium diary, when you get your first sticks repair the fence and speak to Murcaily then resume chopping. If you get a gout tuber before you reached 100% favour kill jungle spiders (north of the calquat farming patch) to get to 100%. Also prepare and cook a spider on a stick along the way for the diary. If you are taking too much damage, buy more bread from the general store.</w:t>
+        <w:t xml:space="preserve">), chop dense (not light) jungle to get a gout tuber for the medium diary, when you get your first sticks repair the fence and speak to Murcaily then resume chopping. If you get a gout tuber before you reached 100% favour kill jungle spiders (north of the calquat farming patch) to get to 100%. Also prepare and cook a spider on a stick along the way for the diary. If you are taking too much damage, buy more bread from the general store.</w:t>
       </w:r>
     </w:p>
     <w:p>
@@ -35624,7 +35570,7 @@
         <w:rPr>
           <w:rtl w:val="0"/>
         </w:rPr>
-        <w:t xml:space="preserve">You will need a whiteberry soon, so make sure to grow a whiteberry bush.</w:t>
+        <w:t xml:space="preserve">You will need a whiteberry soon, so make sure to grow a whiteberry bush. This step contains a lot of farming information, that you are expected to use over a long time across many future steps.</w:t>
       </w:r>
       <w:r>
         <w:rPr>
@@ -36137,7 +36083,7 @@
           <w:color w:val="ff0000"/>
           <w:rtl w:val="0"/>
         </w:rPr>
-        <w:t xml:space="preserve">Note: until you get to Chapter 2, Step 66 you will be stuck with ‘amateur’ herb runs as the best herb run option. It is recommended to postpone herb runs until that step, while maintaining farming contracts and other hourlies. If you find you need herblore levels, potions or want to do herb runs anyway, check the farming guide linked below and ignore patches that are difficult to reach (on the Arceuus spellbook), doing runs with fewer patches instead. This means, for example, only visiting the Falador farming patch as many times per day as you have explorer’s ring teleports. Until Chapter 2, Step 66 all mentions of herb runs refer to optional, low efficiency herb runs.</w:t>
+        <w:t xml:space="preserve">Note: until you get to Chapter 2, Step 70 you will be stuck with ‘amateur’ herb runs as the best herb run option. It is recommended to postpone herb runs until that step, while maintaining farming contracts and other hourlies. If you find you need herblore levels, potions or want to do herb runs anyway, check the farming guide linked below and ignore patches that are difficult to reach (on the Arceuus spellbook), doing runs with fewer patches instead. This means, for example, only visiting the Falador farming patch as many times per day as you have explorer’s ring teleports. Until Chapter 2, Step 66 all mentions of herb runs refer to optional, low efficiency herb runs.</w:t>
       </w:r>
     </w:p>
     <w:p>
@@ -36729,6 +36675,12 @@
         <w:jc w:val="left"/>
         <w:rPr/>
       </w:pPr>
+      <w:r>
+        <w:rPr>
+          <w:rtl w:val="0"/>
+        </w:rPr>
+        <w:t xml:space="preserve">Make sure you are still on the standard spellbook. </w:t>
+      </w:r>
       <w:r>
         <w:rPr>
           <w:b w:val="0"/>
@@ -40277,7 +40229,7 @@
             <w:u w:val="single"/>
             <w:rtl w:val="0"/>
           </w:rPr>
-          <w:t xml:space="preserve">20260830Chapter1</w:t>
+          <w:t xml:space="preserve">20261019Chapter1</w:t>
         </w:r>
       </w:hyperlink>
       <w:r>
@@ -40304,7 +40256,7 @@
             <w:u w:val="single"/>
             <w:rtl w:val="0"/>
           </w:rPr>
-          <w:t xml:space="preserve">20260830Chapter2</w:t>
+          <w:t xml:space="preserve">20261019Chapter2</w:t>
         </w:r>
       </w:hyperlink>
       <w:r>
@@ -40331,7 +40283,7 @@
             <w:u w:val="single"/>
             <w:rtl w:val="0"/>
           </w:rPr>
-          <w:t xml:space="preserve">20260830Chapter3</w:t>
+          <w:t xml:space="preserve">20261019Chapter3</w:t>
         </w:r>
       </w:hyperlink>
       <w:r>
@@ -40358,7 +40310,7 @@
             <w:u w:val="single"/>
             <w:rtl w:val="0"/>
           </w:rPr>
-          <w:t xml:space="preserve">20260830DetailedStepsGuide</w:t>
+          <w:t xml:space="preserve">20261019DetailedStepsGuide</w:t>
         </w:r>
       </w:hyperlink>
       <w:r>
@@ -41035,7 +40987,11 @@
     <w:p>
       <w:pPr>
         <w:spacing w:line="276" w:lineRule="auto"/>
-        <w:rPr/>
+        <w:rPr>
+          <w:rFonts w:ascii="Arial" w:cs="Arial" w:eastAsia="Arial" w:hAnsi="Arial"/>
+          <w:sz w:val="22"/>
+          <w:szCs w:val="22"/>
+        </w:rPr>
       </w:pPr>
       <w:hyperlink r:id="rId67">
         <w:r>
@@ -41056,6 +41012,31 @@
     <w:p>
       <w:pPr>
         <w:spacing w:line="276" w:lineRule="auto"/>
+        <w:rPr>
+          <w:sz w:val="26"/>
+          <w:szCs w:val="26"/>
+        </w:rPr>
+      </w:pPr>
+      <w:hyperlink r:id="rId68">
+        <w:r>
+          <w:rPr>
+            <w:rFonts w:ascii="Arial" w:cs="Arial" w:eastAsia="Arial" w:hAnsi="Arial"/>
+            <w:color w:val="1155cc"/>
+            <w:u w:val="single"/>
+            <w:rtl w:val="0"/>
+          </w:rPr>
+          <w:t xml:space="preserve">20261018BRUHsailerChangelog.txt</w:t>
+        </w:r>
+      </w:hyperlink>
+      <w:r>
+        <w:rPr>
+          <w:rtl w:val="0"/>
+        </w:rPr>
+      </w:r>
+    </w:p>
+    <w:p>
+      <w:pPr>
+        <w:spacing w:line="276" w:lineRule="auto"/>
         <w:rPr/>
       </w:pPr>
       <w:r>
@@ -41065,7 +41046,7 @@
       </w:r>
     </w:p>
     <w:sectPr>
-      <w:footerReference r:id="rId68" w:type="default"/>
+      <w:footerReference r:id="rId69" w:type="default"/>
       <w:pgSz w:h="15840" w:w="12240" w:orient="portrait"/>
       <w:pgMar w:bottom="1693" w:top="1134" w:left="1134" w:right="1134" w:header="0" w:footer="1134"/>
       <w:pgNumType w:start="1"/>

</xml_diff>